<commit_message>
fix dates and reg numbers
</commit_message>
<xml_diff>
--- a/storage/app/templates/garant.docx
+++ b/storage/app/templates/garant.docx
@@ -181,6 +181,9 @@
             <w:pPr>
               <w:spacing w:after="60"/>
               <w:jc w:val="right"/>
+              <w:rPr>
+                <w:lang w:val="en-US"/>
+              </w:rPr>
             </w:pPr>
             <w:r>
               <w:rPr>
@@ -190,13 +193,43 @@
                 <w:color w:val="1A1A1A"/>
                 <w:sz w:val="36"/>
                 <w:szCs w:val="36"/>
-              </w:rPr>
-              <w:t>____ / 202__</w:t>
+                <w:lang w:val="en-US"/>
+              </w:rPr>
+              <w:t>${</w:t>
+            </w:r>
+            <w:r>
+              <w:rPr>
+                <w:rFonts w:ascii="Cambria" w:eastAsia="Cambria" w:hAnsi="Cambria" w:cs="Cambria"/>
+                <w:b/>
+                <w:bCs/>
+                <w:color w:val="1A1A1A"/>
+                <w:sz w:val="36"/>
+                <w:szCs w:val="36"/>
+                <w:lang w:val="en-US"/>
+              </w:rPr>
+              <w:t>garant</w:t>
+            </w:r>
+            <w:bookmarkStart w:id="0" w:name="_GoBack"/>
+            <w:bookmarkEnd w:id="0"/>
+            <w:r>
+              <w:rPr>
+                <w:rFonts w:ascii="Cambria" w:eastAsia="Cambria" w:hAnsi="Cambria" w:cs="Cambria"/>
+                <w:b/>
+                <w:bCs/>
+                <w:color w:val="1A1A1A"/>
+                <w:sz w:val="36"/>
+                <w:szCs w:val="36"/>
+                <w:lang w:val="en-US"/>
+              </w:rPr>
+              <w:t>_number}</w:t>
             </w:r>
           </w:p>
           <w:p>
             <w:pPr>
               <w:jc w:val="right"/>
+              <w:rPr>
+                <w:lang w:val="en-US"/>
+              </w:rPr>
             </w:pPr>
             <w:r>
               <w:rPr>
@@ -204,13 +237,194 @@
                 <w:sz w:val="16"/>
                 <w:szCs w:val="16"/>
               </w:rPr>
-              <w:t>г. Астана · «____» ____________ 202__ г.</w:t>
+              <w:t>г</w:t>
+            </w:r>
+            <w:r>
+              <w:rPr>
+                <w:color w:val="555555"/>
+                <w:sz w:val="16"/>
+                <w:szCs w:val="16"/>
+                <w:lang w:val="en-US"/>
+              </w:rPr>
+              <w:t xml:space="preserve">. </w:t>
+            </w:r>
+            <w:r>
+              <w:rPr>
+                <w:color w:val="555555"/>
+                <w:sz w:val="16"/>
+                <w:szCs w:val="16"/>
+              </w:rPr>
+              <w:t>Астана</w:t>
+            </w:r>
+            <w:r>
+              <w:rPr>
+                <w:color w:val="555555"/>
+                <w:sz w:val="16"/>
+                <w:szCs w:val="16"/>
+                <w:lang w:val="en-US"/>
+              </w:rPr>
+              <w:t xml:space="preserve"> · </w:t>
+            </w:r>
+            <w:r>
+              <w:rPr>
+                <w:color w:val="555555"/>
+                <w:sz w:val="16"/>
+                <w:szCs w:val="16"/>
+                <w:lang w:val="en-US"/>
+              </w:rPr>
+              <w:t>«</w:t>
+            </w:r>
+            <w:r>
+              <w:rPr>
+                <w:color w:val="555555"/>
+                <w:sz w:val="16"/>
+                <w:szCs w:val="16"/>
+                <w:u w:val="single"/>
+                <w:lang w:val="en-US"/>
+              </w:rPr>
+              <w:t>${</w:t>
+            </w:r>
+            <w:proofErr w:type="spellStart"/>
+            <w:r>
+              <w:rPr>
+                <w:color w:val="555555"/>
+                <w:sz w:val="16"/>
+                <w:szCs w:val="16"/>
+                <w:u w:val="single"/>
+                <w:lang w:val="en-US"/>
+              </w:rPr>
+              <w:t>check_date_day</w:t>
+            </w:r>
+            <w:proofErr w:type="spellEnd"/>
+            <w:r>
+              <w:rPr>
+                <w:color w:val="555555"/>
+                <w:sz w:val="16"/>
+                <w:szCs w:val="16"/>
+                <w:u w:val="single"/>
+                <w:lang w:val="en-US"/>
+              </w:rPr>
+              <w:t>}</w:t>
+            </w:r>
+            <w:r>
+              <w:rPr>
+                <w:color w:val="555555"/>
+                <w:sz w:val="16"/>
+                <w:szCs w:val="16"/>
+                <w:lang w:val="en-US"/>
+              </w:rPr>
+              <w:t xml:space="preserve">» </w:t>
+            </w:r>
+            <w:r>
+              <w:rPr>
+                <w:color w:val="555555"/>
+                <w:sz w:val="16"/>
+                <w:szCs w:val="16"/>
+                <w:u w:val="single"/>
+                <w:lang w:val="en-US"/>
+              </w:rPr>
+              <w:t>${</w:t>
+            </w:r>
+            <w:proofErr w:type="spellStart"/>
+            <w:r>
+              <w:rPr>
+                <w:color w:val="555555"/>
+                <w:sz w:val="16"/>
+                <w:szCs w:val="16"/>
+                <w:u w:val="single"/>
+                <w:lang w:val="en-US"/>
+              </w:rPr>
+              <w:t>check_date_month</w:t>
+            </w:r>
+            <w:proofErr w:type="spellEnd"/>
+            <w:r>
+              <w:rPr>
+                <w:color w:val="555555"/>
+                <w:sz w:val="16"/>
+                <w:szCs w:val="16"/>
+                <w:u w:val="single"/>
+                <w:lang w:val="en-US"/>
+              </w:rPr>
+              <w:t>}</w:t>
+            </w:r>
+            <w:r>
+              <w:rPr>
+                <w:color w:val="555555"/>
+                <w:sz w:val="16"/>
+                <w:szCs w:val="16"/>
+                <w:lang w:val="en-US"/>
+              </w:rPr>
+              <w:t xml:space="preserve"> 202</w:t>
+            </w:r>
+            <w:r>
+              <w:rPr>
+                <w:color w:val="555555"/>
+                <w:sz w:val="16"/>
+                <w:szCs w:val="16"/>
+                <w:u w:val="single"/>
+                <w:lang w:val="en-US"/>
+              </w:rPr>
+              <w:t>${</w:t>
+            </w:r>
+            <w:proofErr w:type="spellStart"/>
+            <w:r>
+              <w:rPr>
+                <w:color w:val="555555"/>
+                <w:sz w:val="16"/>
+                <w:szCs w:val="16"/>
+                <w:u w:val="single"/>
+                <w:lang w:val="en-US"/>
+              </w:rPr>
+              <w:t>check_date_year</w:t>
+            </w:r>
+            <w:proofErr w:type="spellEnd"/>
+            <w:r>
+              <w:rPr>
+                <w:color w:val="555555"/>
+                <w:sz w:val="16"/>
+                <w:szCs w:val="16"/>
+                <w:u w:val="single"/>
+                <w:lang w:val="en-US"/>
+              </w:rPr>
+              <w:t>}</w:t>
+            </w:r>
+            <w:r>
+              <w:rPr>
+                <w:color w:val="555555"/>
+                <w:sz w:val="16"/>
+                <w:szCs w:val="16"/>
+                <w:lang w:val="en-US"/>
+              </w:rPr>
+              <w:t xml:space="preserve"> </w:t>
+            </w:r>
+            <w:r>
+              <w:rPr>
+                <w:color w:val="555555"/>
+                <w:sz w:val="16"/>
+                <w:szCs w:val="16"/>
+              </w:rPr>
+              <w:t>г</w:t>
+            </w:r>
+            <w:r>
+              <w:rPr>
+                <w:color w:val="555555"/>
+                <w:sz w:val="16"/>
+                <w:szCs w:val="16"/>
+                <w:lang w:val="en-US"/>
+              </w:rPr>
+              <w:t>.</w:t>
             </w:r>
           </w:p>
         </w:tc>
       </w:tr>
     </w:tbl>
-    <w:p/>
+    <w:p>
+      <w:pPr>
+        <w:rPr>
+          <w:lang w:val="en-US"/>
+        </w:rPr>
+      </w:pPr>
+    </w:p>
     <w:p>
       <w:pPr>
         <w:spacing w:before="200" w:after="100"/>
@@ -1557,8 +1771,6 @@
               </w:rPr>
               <w:t>Действует только при наличии фискального чека</w:t>
             </w:r>
-            <w:bookmarkStart w:id="0" w:name="_GoBack"/>
-            <w:bookmarkEnd w:id="0"/>
           </w:p>
         </w:tc>
       </w:tr>

</xml_diff>